<commit_message>
added case files other than disk images (too large), updated scripts, updated logs
</commit_message>
<xml_diff>
--- a/Weekly Logs/Matt/Matt Baker - Week 14 Individual Logbook.docx
+++ b/Weekly Logs/Matt/Matt Baker - Week 14 Individual Logbook.docx
@@ -3777,15 +3777,7 @@
         <w:t>Nvidia</w:t>
       </w:r>
       <w:r>
-        <w:t xml:space="preserve"> </w:t>
-      </w:r>
-      <w:proofErr w:type="spellStart"/>
-      <w:r>
-        <w:t>smi</w:t>
-      </w:r>
-      <w:proofErr w:type="spellEnd"/>
-      <w:r>
-        <w:t xml:space="preserve"> metric recording script, and terminal three (3) monitors the script output.</w:t>
+        <w:t xml:space="preserve"> smi metric recording script, and terminal three (3) monitors the script output.</w:t>
       </w:r>
     </w:p>
     <w:p>
@@ -3903,6 +3895,9 @@
         <w:ind w:left="0" w:firstLine="0"/>
       </w:pPr>
       <w:r>
+        <w:rPr>
+          <w:noProof/>
+        </w:rPr>
         <w:drawing>
           <wp:inline distT="0" distB="0" distL="0" distR="0" wp14:anchorId="2CC921EC" wp14:editId="1A69AA45">
             <wp:extent cx="2129051" cy="3011063"/>
@@ -3946,6 +3941,9 @@
         <w:t xml:space="preserve"> </w:t>
       </w:r>
       <w:r>
+        <w:rPr>
+          <w:noProof/>
+        </w:rPr>
         <w:drawing>
           <wp:inline distT="0" distB="0" distL="0" distR="0" wp14:anchorId="18DA1E0B" wp14:editId="63CE3B50">
             <wp:extent cx="2053989" cy="2914694"/>
@@ -3991,6 +3989,9 @@
         </w:rPr>
       </w:pPr>
       <w:r>
+        <w:rPr>
+          <w:noProof/>
+        </w:rPr>
         <w:drawing>
           <wp:inline distT="0" distB="0" distL="0" distR="0" wp14:anchorId="46E709BD" wp14:editId="7C6982BD">
             <wp:extent cx="1854310" cy="2621274"/>
@@ -4034,6 +4035,9 @@
         <w:t xml:space="preserve"> </w:t>
       </w:r>
       <w:r>
+        <w:rPr>
+          <w:noProof/>
+        </w:rPr>
         <w:drawing>
           <wp:inline distT="0" distB="0" distL="0" distR="0" wp14:anchorId="57564B83" wp14:editId="3059DBB4">
             <wp:extent cx="1843131" cy="2603425"/>
@@ -4071,6 +4075,9 @@
         </w:drawing>
       </w:r>
       <w:r>
+        <w:rPr>
+          <w:noProof/>
+        </w:rPr>
         <w:drawing>
           <wp:inline distT="0" distB="0" distL="0" distR="0" wp14:anchorId="3305B5FA" wp14:editId="03CB49C6">
             <wp:extent cx="1890215" cy="2677471"/>
@@ -4127,169 +4134,32 @@
     <w:p>
       <w:pPr>
         <w:ind w:left="0" w:firstLine="0"/>
+        <w:rPr>
+          <w:noProof/>
+        </w:rPr>
       </w:pPr>
     </w:p>
     <w:p>
       <w:pPr>
         <w:ind w:left="0" w:firstLine="0"/>
+        <w:rPr>
+          <w:noProof/>
+        </w:rPr>
       </w:pPr>
     </w:p>
     <w:p>
       <w:pPr>
         <w:ind w:left="0" w:firstLine="0"/>
-      </w:pPr>
-    </w:p>
-    <w:p>
-      <w:pPr>
-        <w:ind w:left="0" w:firstLine="0"/>
-      </w:pPr>
-    </w:p>
-    <w:p>
-      <w:pPr>
-        <w:ind w:left="0" w:firstLine="0"/>
-      </w:pPr>
-    </w:p>
-    <w:p>
-      <w:pPr>
-        <w:ind w:left="0" w:firstLine="0"/>
-      </w:pPr>
-    </w:p>
-    <w:p>
-      <w:pPr>
-        <w:ind w:left="0" w:firstLine="0"/>
-      </w:pPr>
-    </w:p>
-    <w:p>
-      <w:pPr>
-        <w:ind w:left="0" w:firstLine="0"/>
-      </w:pPr>
-    </w:p>
-    <w:p>
-      <w:pPr>
-        <w:ind w:left="0" w:firstLine="0"/>
-      </w:pPr>
-    </w:p>
-    <w:p>
-      <w:pPr>
-        <w:ind w:left="0" w:firstLine="0"/>
-      </w:pPr>
-    </w:p>
-    <w:p>
-      <w:pPr>
-        <w:ind w:left="0" w:firstLine="0"/>
-      </w:pPr>
-    </w:p>
-    <w:p>
-      <w:pPr>
-        <w:ind w:left="0" w:firstLine="0"/>
-      </w:pPr>
-    </w:p>
-    <w:p>
-      <w:pPr>
-        <w:ind w:left="0" w:firstLine="0"/>
-      </w:pPr>
-    </w:p>
-    <w:p>
-      <w:pPr>
-        <w:ind w:left="0" w:firstLine="0"/>
-      </w:pPr>
-    </w:p>
-    <w:p>
-      <w:pPr>
-        <w:ind w:left="0" w:firstLine="0"/>
-      </w:pPr>
-    </w:p>
-    <w:p>
-      <w:pPr>
-        <w:ind w:left="0" w:firstLine="0"/>
-      </w:pPr>
-    </w:p>
-    <w:p>
-      <w:pPr>
-        <w:ind w:left="0" w:firstLine="0"/>
-      </w:pPr>
-    </w:p>
-    <w:p>
-      <w:pPr>
-        <w:ind w:left="0" w:firstLine="0"/>
-      </w:pPr>
-    </w:p>
-    <w:p>
-      <w:pPr>
-        <w:ind w:left="0" w:firstLine="0"/>
-      </w:pPr>
-    </w:p>
-    <w:p>
-      <w:pPr>
-        <w:ind w:left="0" w:firstLine="0"/>
-      </w:pPr>
-    </w:p>
-    <w:p>
-      <w:pPr>
-        <w:ind w:left="0" w:firstLine="0"/>
-      </w:pPr>
-    </w:p>
-    <w:p>
-      <w:pPr>
-        <w:ind w:left="0" w:firstLine="0"/>
-      </w:pPr>
-    </w:p>
-    <w:p>
-      <w:pPr>
-        <w:ind w:left="0" w:firstLine="0"/>
-      </w:pPr>
-    </w:p>
-    <w:p>
-      <w:pPr>
-        <w:ind w:left="0" w:firstLine="0"/>
-      </w:pPr>
-    </w:p>
-    <w:p>
-      <w:pPr>
-        <w:ind w:left="0" w:firstLine="0"/>
-      </w:pPr>
-    </w:p>
-    <w:p>
-      <w:pPr>
-        <w:ind w:left="0" w:firstLine="0"/>
-      </w:pPr>
-    </w:p>
-    <w:p>
-      <w:pPr>
-        <w:ind w:left="0" w:firstLine="0"/>
-      </w:pPr>
-    </w:p>
-    <w:p>
-      <w:pPr>
-        <w:ind w:left="0" w:firstLine="0"/>
-      </w:pPr>
-    </w:p>
-    <w:p>
-      <w:pPr>
-        <w:pStyle w:val="Heading2"/>
-      </w:pPr>
-      <w:bookmarkStart w:id="8" w:name="_Toc242865859"/>
-      <w:r>
-        <w:t>Testing</w:t>
-      </w:r>
-      <w:bookmarkEnd w:id="8"/>
-    </w:p>
-    <w:p>
-      <w:pPr>
-        <w:pStyle w:val="Heading2"/>
-      </w:pPr>
-      <w:bookmarkStart w:id="9" w:name="_Toc242865860"/>
-      <w:r>
-        <w:t>Development</w:t>
-      </w:r>
-      <w:bookmarkEnd w:id="9"/>
-    </w:p>
-    <w:p>
-      <w:pPr>
-        <w:ind w:left="0" w:firstLine="0"/>
-      </w:pPr>
-      <w:r>
-        <w:t>Monday, 12 October</w:t>
+        <w:rPr>
+          <w:noProof/>
+        </w:rPr>
+      </w:pPr>
+      <w:r>
+        <w:rPr>
+          <w:noProof/>
+        </w:rPr>
+        <w:lastRenderedPageBreak/>
+        <w:t>Thursday, October 15</w:t>
       </w:r>
     </w:p>
     <w:p>
@@ -4298,62 +4168,1675 @@
         <w:rPr>
           <w:b/>
           <w:bCs/>
+          <w:noProof/>
         </w:rPr>
       </w:pPr>
       <w:r>
         <w:rPr>
           <w:b/>
           <w:bCs/>
-        </w:rPr>
-        <w:t>12:30 – 1:</w:t>
-      </w:r>
-      <w:r>
+          <w:noProof/>
+        </w:rPr>
+        <w:t xml:space="preserve">11:30 - </w:t>
+      </w:r>
+    </w:p>
+    <w:p>
+      <w:pPr>
+        <w:ind w:left="0" w:firstLine="0"/>
+        <w:rPr>
+          <w:noProof/>
+        </w:rPr>
+      </w:pPr>
+      <w:r>
+        <w:rPr>
+          <w:noProof/>
+        </w:rPr>
+        <w:t>Working on research report.</w:t>
+      </w:r>
+      <w:r>
+        <w:rPr>
+          <w:noProof/>
+        </w:rPr>
+        <w:t xml:space="preserve"> </w:t>
+      </w:r>
+      <w:r>
+        <w:rPr>
+          <w:noProof/>
+        </w:rPr>
+        <w:t>Recording documented findings.</w:t>
+      </w:r>
+      <w:r>
+        <w:rPr>
+          <w:noProof/>
+        </w:rPr>
+        <w:t xml:space="preserve"> Producing reccomendations for the client.</w:t>
+      </w:r>
+      <w:r>
+        <w:rPr>
+          <w:noProof/>
+        </w:rPr>
+        <w:t xml:space="preserve"> </w:t>
+      </w:r>
+      <w:r>
+        <w:rPr>
+          <w:noProof/>
+        </w:rPr>
+        <w:t>Recorded size difference in pcap vs csv, moved latest test cases to git.</w:t>
+      </w:r>
+    </w:p>
+    <w:p>
+      <w:pPr>
+        <w:ind w:left="0" w:firstLine="0"/>
+        <w:rPr>
+          <w:noProof/>
+        </w:rPr>
+      </w:pPr>
+    </w:p>
+    <w:p>
+      <w:pPr>
+        <w:ind w:left="0" w:firstLine="0"/>
+        <w:rPr>
+          <w:noProof/>
+        </w:rPr>
+      </w:pPr>
+    </w:p>
+    <w:p>
+      <w:pPr>
+        <w:ind w:left="0" w:firstLine="0"/>
+        <w:rPr>
+          <w:noProof/>
+        </w:rPr>
+      </w:pPr>
+    </w:p>
+    <w:p>
+      <w:pPr>
+        <w:ind w:left="0" w:firstLine="0"/>
+        <w:rPr>
+          <w:noProof/>
+        </w:rPr>
+      </w:pPr>
+    </w:p>
+    <w:p>
+      <w:pPr>
+        <w:ind w:left="0" w:firstLine="0"/>
+        <w:rPr>
+          <w:noProof/>
+        </w:rPr>
+      </w:pPr>
+    </w:p>
+    <w:p>
+      <w:pPr>
+        <w:ind w:left="0" w:firstLine="0"/>
+        <w:rPr>
+          <w:noProof/>
+        </w:rPr>
+      </w:pPr>
+    </w:p>
+    <w:p>
+      <w:pPr>
+        <w:ind w:left="0" w:firstLine="0"/>
+        <w:rPr>
+          <w:noProof/>
+        </w:rPr>
+      </w:pPr>
+    </w:p>
+    <w:p>
+      <w:pPr>
+        <w:ind w:left="0" w:firstLine="0"/>
+        <w:rPr>
+          <w:noProof/>
+        </w:rPr>
+      </w:pPr>
+    </w:p>
+    <w:p>
+      <w:pPr>
+        <w:ind w:left="0" w:firstLine="0"/>
+        <w:rPr>
+          <w:noProof/>
+        </w:rPr>
+      </w:pPr>
+    </w:p>
+    <w:p>
+      <w:pPr>
+        <w:ind w:left="0" w:firstLine="0"/>
+        <w:rPr>
+          <w:noProof/>
+        </w:rPr>
+      </w:pPr>
+    </w:p>
+    <w:p>
+      <w:pPr>
+        <w:ind w:left="0" w:firstLine="0"/>
+        <w:rPr>
+          <w:noProof/>
+        </w:rPr>
+      </w:pPr>
+    </w:p>
+    <w:p>
+      <w:pPr>
+        <w:ind w:left="0" w:firstLine="0"/>
+        <w:rPr>
+          <w:noProof/>
+        </w:rPr>
+      </w:pPr>
+    </w:p>
+    <w:p>
+      <w:pPr>
+        <w:ind w:left="0" w:firstLine="0"/>
+        <w:rPr>
+          <w:noProof/>
+        </w:rPr>
+      </w:pPr>
+    </w:p>
+    <w:p>
+      <w:pPr>
+        <w:ind w:left="0" w:firstLine="0"/>
+        <w:rPr>
+          <w:noProof/>
+        </w:rPr>
+      </w:pPr>
+    </w:p>
+    <w:p>
+      <w:pPr>
+        <w:ind w:left="0" w:firstLine="0"/>
+        <w:rPr>
+          <w:noProof/>
+        </w:rPr>
+      </w:pPr>
+    </w:p>
+    <w:p>
+      <w:pPr>
+        <w:ind w:left="0" w:firstLine="0"/>
+        <w:rPr>
+          <w:noProof/>
+        </w:rPr>
+      </w:pPr>
+    </w:p>
+    <w:p>
+      <w:pPr>
+        <w:ind w:left="0" w:firstLine="0"/>
+        <w:rPr>
+          <w:noProof/>
+        </w:rPr>
+      </w:pPr>
+    </w:p>
+    <w:p>
+      <w:pPr>
+        <w:ind w:left="0" w:firstLine="0"/>
+        <w:rPr>
+          <w:noProof/>
+        </w:rPr>
+      </w:pPr>
+    </w:p>
+    <w:p>
+      <w:pPr>
+        <w:ind w:left="0" w:firstLine="0"/>
+        <w:rPr>
+          <w:noProof/>
+        </w:rPr>
+      </w:pPr>
+    </w:p>
+    <w:p>
+      <w:pPr>
+        <w:ind w:left="0" w:firstLine="0"/>
+        <w:rPr>
+          <w:noProof/>
+        </w:rPr>
+      </w:pPr>
+    </w:p>
+    <w:p>
+      <w:pPr>
+        <w:ind w:left="0" w:firstLine="0"/>
+        <w:rPr>
+          <w:noProof/>
+        </w:rPr>
+      </w:pPr>
+    </w:p>
+    <w:p>
+      <w:pPr>
+        <w:ind w:left="0" w:firstLine="0"/>
+        <w:rPr>
+          <w:noProof/>
+        </w:rPr>
+      </w:pPr>
+    </w:p>
+    <w:p>
+      <w:pPr>
+        <w:ind w:left="0" w:firstLine="0"/>
+        <w:rPr>
+          <w:noProof/>
+        </w:rPr>
+      </w:pPr>
+    </w:p>
+    <w:p>
+      <w:pPr>
+        <w:ind w:left="0" w:firstLine="0"/>
+        <w:rPr>
+          <w:noProof/>
+        </w:rPr>
+      </w:pPr>
+    </w:p>
+    <w:p>
+      <w:pPr>
+        <w:ind w:left="0" w:firstLine="0"/>
+        <w:rPr>
+          <w:noProof/>
+        </w:rPr>
+      </w:pPr>
+    </w:p>
+    <w:p>
+      <w:pPr>
+        <w:ind w:left="0" w:firstLine="0"/>
+      </w:pPr>
+    </w:p>
+    <w:p>
+      <w:pPr>
+        <w:ind w:left="0" w:firstLine="0"/>
+      </w:pPr>
+    </w:p>
+    <w:p>
+      <w:pPr>
+        <w:pStyle w:val="Heading2"/>
+      </w:pPr>
+      <w:bookmarkStart w:id="8" w:name="_Toc242865859"/>
+      <w:r>
+        <w:lastRenderedPageBreak/>
+        <w:t>Testing</w:t>
+      </w:r>
+      <w:bookmarkEnd w:id="8"/>
+    </w:p>
+    <w:p>
+      <w:r>
+        <w:t>Wednesday, October 14</w:t>
+      </w:r>
+    </w:p>
+    <w:p>
+      <w:pPr>
         <w:rPr>
           <w:b/>
           <w:bCs/>
         </w:rPr>
-        <w:t>45</w:t>
-      </w:r>
+      </w:pPr>
       <w:r>
         <w:rPr>
           <w:b/>
           <w:bCs/>
         </w:rPr>
-        <w:t>PM</w:t>
+        <w:t xml:space="preserve">4:30 </w:t>
       </w:r>
       <w:r>
         <w:rPr>
           <w:b/>
           <w:bCs/>
         </w:rPr>
-        <w:t xml:space="preserve"> (</w:t>
+        <w:t>–</w:t>
       </w:r>
       <w:r>
         <w:rPr>
           <w:b/>
           <w:bCs/>
         </w:rPr>
-        <w:t>1hr</w:t>
+        <w:t xml:space="preserve"> </w:t>
       </w:r>
       <w:r>
         <w:rPr>
           <w:b/>
           <w:bCs/>
         </w:rPr>
-        <w:t xml:space="preserve"> 15min</w:t>
+        <w:t>7:00</w:t>
       </w:r>
       <w:r>
         <w:rPr>
           <w:b/>
           <w:bCs/>
         </w:rPr>
+        <w:t xml:space="preserve"> (2hrs </w:t>
+      </w:r>
+      <w:r>
+        <w:rPr>
+          <w:b/>
+          <w:bCs/>
+        </w:rPr>
+        <w:t>30</w:t>
+      </w:r>
+      <w:r>
+        <w:rPr>
+          <w:b/>
+          <w:bCs/>
+        </w:rPr>
+        <w:t xml:space="preserve"> min</w:t>
+      </w:r>
+      <w:r>
+        <w:rPr>
+          <w:b/>
+          <w:bCs/>
+        </w:rPr>
         <w:t>)</w:t>
       </w:r>
     </w:p>
     <w:p>
+      <w:r>
+        <w:t>Testing for any observable differences in token cost/time/</w:t>
+      </w:r>
+      <w:r>
+        <w:t xml:space="preserve">report </w:t>
+      </w:r>
+      <w:r>
+        <w:t>quality between Silent</w:t>
+      </w:r>
+      <w:r>
+        <w:t>C</w:t>
+      </w:r>
+      <w:r>
+        <w:t>artographer</w:t>
+      </w:r>
+      <w:r>
+        <w:t xml:space="preserve">V1 </w:t>
+      </w:r>
+      <w:r>
+        <w:t xml:space="preserve">with thinking enabled vs thinking disabled. </w:t>
+      </w:r>
+      <w:r>
+        <w:t>SilentCartographerV2 will have thinking hidden but enabled (--hidethinking)</w:t>
+      </w:r>
+      <w:r>
+        <w:t>.</w:t>
+      </w:r>
+      <w:r>
+        <w:t xml:space="preserve"> Added cleanup of residual TOON file</w:t>
+      </w:r>
+      <w:r>
+        <w:t>, changed specification of xml when asking for input.</w:t>
+      </w:r>
+      <w:r>
+        <w:t xml:space="preserve"> Recorded data in my tests and examined differences in produced </w:t>
+      </w:r>
+      <w:r>
+        <w:t>reports.</w:t>
+      </w:r>
+      <w:r>
+        <w:t xml:space="preserve"> Wrote the findings into the research report.s</w:t>
+      </w:r>
+    </w:p>
+    <w:p>
+      <w:r>
+        <w:t>Tests were ran against a human readable output of an nmap scan.</w:t>
+      </w:r>
+      <w:r>
+        <w:t xml:space="preserve"> Much shorter than an xml.</w:t>
+      </w:r>
+    </w:p>
+    <w:p/>
+    <w:p>
+      <w:pPr>
+        <w:rPr>
+          <w:b/>
+          <w:bCs/>
+        </w:rPr>
+      </w:pPr>
+      <w:r>
+        <w:rPr>
+          <w:b/>
+          <w:bCs/>
+        </w:rPr>
+        <w:t>SCV</w:t>
+      </w:r>
+      <w:r>
+        <w:rPr>
+          <w:b/>
+          <w:bCs/>
+        </w:rPr>
+        <w:t>1</w:t>
+      </w:r>
+      <w:r>
+        <w:rPr>
+          <w:b/>
+          <w:bCs/>
+        </w:rPr>
+        <w:t xml:space="preserve"> (Thinking </w:t>
+      </w:r>
+      <w:r>
+        <w:rPr>
+          <w:b/>
+          <w:bCs/>
+        </w:rPr>
+        <w:t>disabled</w:t>
+      </w:r>
+      <w:r>
+        <w:rPr>
+          <w:b/>
+          <w:bCs/>
+        </w:rPr>
+        <w:t>)</w:t>
+      </w:r>
+    </w:p>
+    <w:tbl>
+      <w:tblPr>
+        <w:tblStyle w:val="TableGrid0"/>
+        <w:tblW w:w="0" w:type="auto"/>
+        <w:tblInd w:w="39" w:type="dxa"/>
+        <w:tblLook w:val="04A0" w:firstRow="1" w:lastRow="0" w:firstColumn="1" w:lastColumn="0" w:noHBand="0" w:noVBand="1"/>
+      </w:tblPr>
+      <w:tblGrid>
+        <w:gridCol w:w="2417"/>
+        <w:gridCol w:w="573"/>
+        <w:gridCol w:w="830"/>
+        <w:gridCol w:w="826"/>
+        <w:gridCol w:w="858"/>
+        <w:gridCol w:w="826"/>
+      </w:tblGrid>
+      <w:tr>
+        <w:tc>
+          <w:tcPr>
+            <w:tcW w:w="1944" w:type="dxa"/>
+          </w:tcPr>
+          <w:p>
+            <w:pPr>
+              <w:ind w:left="0" w:firstLine="0"/>
+            </w:pPr>
+            <w:r>
+              <w:t>Input Data</w:t>
+            </w:r>
+          </w:p>
+        </w:tc>
+        <w:tc>
+          <w:tcPr>
+            <w:tcW w:w="573" w:type="dxa"/>
+          </w:tcPr>
+          <w:p>
+            <w:pPr>
+              <w:ind w:left="0" w:firstLine="0"/>
+            </w:pPr>
+            <w:r>
+              <w:t>Test</w:t>
+            </w:r>
+          </w:p>
+        </w:tc>
+        <w:tc>
+          <w:tcPr>
+            <w:tcW w:w="830" w:type="dxa"/>
+          </w:tcPr>
+          <w:p>
+            <w:pPr>
+              <w:ind w:left="0" w:firstLine="0"/>
+            </w:pPr>
+            <w:r>
+              <w:t>Time (s)</w:t>
+            </w:r>
+          </w:p>
+        </w:tc>
+        <w:tc>
+          <w:tcPr>
+            <w:tcW w:w="826" w:type="dxa"/>
+          </w:tcPr>
+          <w:p>
+            <w:pPr>
+              <w:ind w:left="0" w:firstLine="0"/>
+            </w:pPr>
+            <w:r>
+              <w:t>Input Tokens</w:t>
+            </w:r>
+          </w:p>
+        </w:tc>
+        <w:tc>
+          <w:tcPr>
+            <w:tcW w:w="858" w:type="dxa"/>
+          </w:tcPr>
+          <w:p>
+            <w:pPr>
+              <w:ind w:left="0" w:firstLine="0"/>
+            </w:pPr>
+            <w:r>
+              <w:t>Output Tokens</w:t>
+            </w:r>
+          </w:p>
+        </w:tc>
+        <w:tc>
+          <w:tcPr>
+            <w:tcW w:w="826" w:type="dxa"/>
+          </w:tcPr>
+          <w:p>
+            <w:pPr>
+              <w:ind w:left="0" w:firstLine="0"/>
+            </w:pPr>
+            <w:r>
+              <w:t>Total Tokens</w:t>
+            </w:r>
+          </w:p>
+        </w:tc>
+      </w:tr>
+      <w:tr>
+        <w:tc>
+          <w:tcPr>
+            <w:tcW w:w="1944" w:type="dxa"/>
+          </w:tcPr>
+          <w:p>
+            <w:pPr>
+              <w:ind w:left="0" w:firstLine="0"/>
+            </w:pPr>
+            <w:r>
+              <w:t>northStarServiceScan.txt</w:t>
+            </w:r>
+          </w:p>
+        </w:tc>
+        <w:tc>
+          <w:tcPr>
+            <w:tcW w:w="573" w:type="dxa"/>
+          </w:tcPr>
+          <w:p>
+            <w:pPr>
+              <w:ind w:left="0" w:firstLine="0"/>
+            </w:pPr>
+            <w:r>
+              <w:t>1</w:t>
+            </w:r>
+          </w:p>
+        </w:tc>
+        <w:tc>
+          <w:tcPr>
+            <w:tcW w:w="830" w:type="dxa"/>
+          </w:tcPr>
+          <w:p>
+            <w:pPr>
+              <w:ind w:left="0" w:firstLine="0"/>
+            </w:pPr>
+            <w:r>
+              <w:t>77.15</w:t>
+            </w:r>
+          </w:p>
+        </w:tc>
+        <w:tc>
+          <w:tcPr>
+            <w:tcW w:w="826" w:type="dxa"/>
+          </w:tcPr>
+          <w:p>
+            <w:pPr>
+              <w:ind w:left="0" w:firstLine="0"/>
+            </w:pPr>
+            <w:r>
+              <w:t>3473</w:t>
+            </w:r>
+          </w:p>
+        </w:tc>
+        <w:tc>
+          <w:tcPr>
+            <w:tcW w:w="858" w:type="dxa"/>
+          </w:tcPr>
+          <w:p>
+            <w:pPr>
+              <w:ind w:left="0" w:firstLine="0"/>
+            </w:pPr>
+            <w:r>
+              <w:t>2863</w:t>
+            </w:r>
+          </w:p>
+        </w:tc>
+        <w:tc>
+          <w:tcPr>
+            <w:tcW w:w="826" w:type="dxa"/>
+          </w:tcPr>
+          <w:p>
+            <w:pPr>
+              <w:ind w:left="0" w:firstLine="0"/>
+            </w:pPr>
+            <w:r>
+              <w:t>6336</w:t>
+            </w:r>
+          </w:p>
+        </w:tc>
+      </w:tr>
+      <w:tr>
+        <w:tc>
+          <w:tcPr>
+            <w:tcW w:w="1944" w:type="dxa"/>
+          </w:tcPr>
+          <w:p>
+            <w:pPr>
+              <w:ind w:left="0" w:firstLine="0"/>
+            </w:pPr>
+            <w:r>
+              <w:t>northStarServiceScan.txt</w:t>
+            </w:r>
+          </w:p>
+        </w:tc>
+        <w:tc>
+          <w:tcPr>
+            <w:tcW w:w="573" w:type="dxa"/>
+          </w:tcPr>
+          <w:p>
+            <w:pPr>
+              <w:ind w:left="0" w:firstLine="0"/>
+            </w:pPr>
+            <w:r>
+              <w:t>2</w:t>
+            </w:r>
+          </w:p>
+        </w:tc>
+        <w:tc>
+          <w:tcPr>
+            <w:tcW w:w="830" w:type="dxa"/>
+          </w:tcPr>
+          <w:p>
+            <w:pPr>
+              <w:ind w:left="0" w:firstLine="0"/>
+            </w:pPr>
+            <w:r>
+              <w:t>54.79</w:t>
+            </w:r>
+          </w:p>
+        </w:tc>
+        <w:tc>
+          <w:tcPr>
+            <w:tcW w:w="826" w:type="dxa"/>
+          </w:tcPr>
+          <w:p>
+            <w:pPr>
+              <w:ind w:left="0" w:firstLine="0"/>
+            </w:pPr>
+            <w:r>
+              <w:t>3676</w:t>
+            </w:r>
+          </w:p>
+        </w:tc>
+        <w:tc>
+          <w:tcPr>
+            <w:tcW w:w="858" w:type="dxa"/>
+          </w:tcPr>
+          <w:p>
+            <w:pPr>
+              <w:ind w:left="0" w:firstLine="0"/>
+            </w:pPr>
+            <w:r>
+              <w:t>3110</w:t>
+            </w:r>
+          </w:p>
+        </w:tc>
+        <w:tc>
+          <w:tcPr>
+            <w:tcW w:w="826" w:type="dxa"/>
+          </w:tcPr>
+          <w:p>
+            <w:pPr>
+              <w:ind w:left="0" w:firstLine="0"/>
+            </w:pPr>
+            <w:r>
+              <w:t>6786</w:t>
+            </w:r>
+          </w:p>
+        </w:tc>
+      </w:tr>
+      <w:tr>
+        <w:tc>
+          <w:tcPr>
+            <w:tcW w:w="1944" w:type="dxa"/>
+          </w:tcPr>
+          <w:p>
+            <w:pPr>
+              <w:ind w:left="0" w:firstLine="0"/>
+            </w:pPr>
+            <w:r>
+              <w:t>northStarServiceScan.txt</w:t>
+            </w:r>
+          </w:p>
+        </w:tc>
+        <w:tc>
+          <w:tcPr>
+            <w:tcW w:w="573" w:type="dxa"/>
+          </w:tcPr>
+          <w:p>
+            <w:pPr>
+              <w:ind w:left="0" w:firstLine="0"/>
+            </w:pPr>
+            <w:r>
+              <w:t>3</w:t>
+            </w:r>
+          </w:p>
+        </w:tc>
+        <w:tc>
+          <w:tcPr>
+            <w:tcW w:w="830" w:type="dxa"/>
+          </w:tcPr>
+          <w:p>
+            <w:pPr>
+              <w:ind w:left="0" w:firstLine="0"/>
+            </w:pPr>
+            <w:r>
+              <w:t>52.60</w:t>
+            </w:r>
+          </w:p>
+        </w:tc>
+        <w:tc>
+          <w:tcPr>
+            <w:tcW w:w="826" w:type="dxa"/>
+          </w:tcPr>
+          <w:p>
+            <w:pPr>
+              <w:ind w:left="0" w:firstLine="0"/>
+            </w:pPr>
+            <w:r>
+              <w:t>3676</w:t>
+            </w:r>
+          </w:p>
+        </w:tc>
+        <w:tc>
+          <w:tcPr>
+            <w:tcW w:w="858" w:type="dxa"/>
+          </w:tcPr>
+          <w:p>
+            <w:pPr>
+              <w:ind w:left="0" w:firstLine="0"/>
+            </w:pPr>
+            <w:r>
+              <w:t>3164</w:t>
+            </w:r>
+          </w:p>
+        </w:tc>
+        <w:tc>
+          <w:tcPr>
+            <w:tcW w:w="826" w:type="dxa"/>
+          </w:tcPr>
+          <w:p>
+            <w:pPr>
+              <w:ind w:left="0" w:firstLine="0"/>
+            </w:pPr>
+            <w:r>
+              <w:t>6840</w:t>
+            </w:r>
+          </w:p>
+        </w:tc>
+      </w:tr>
+    </w:tbl>
+    <w:p>
       <w:pPr>
         <w:ind w:left="0" w:firstLine="0"/>
       </w:pPr>
+    </w:p>
+    <w:p>
+      <w:pPr>
+        <w:rPr>
+          <w:b/>
+          <w:bCs/>
+        </w:rPr>
+      </w:pPr>
+      <w:r>
+        <w:rPr>
+          <w:b/>
+          <w:bCs/>
+        </w:rPr>
+        <w:t>SCV</w:t>
+      </w:r>
+      <w:r>
+        <w:rPr>
+          <w:b/>
+          <w:bCs/>
+        </w:rPr>
+        <w:t>2</w:t>
+      </w:r>
+      <w:r>
+        <w:rPr>
+          <w:b/>
+          <w:bCs/>
+        </w:rPr>
+        <w:t xml:space="preserve"> (Thinking </w:t>
+      </w:r>
+      <w:r>
+        <w:rPr>
+          <w:b/>
+          <w:bCs/>
+        </w:rPr>
+        <w:t>ena</w:t>
+      </w:r>
+      <w:r>
+        <w:rPr>
+          <w:b/>
+          <w:bCs/>
+        </w:rPr>
+        <w:t>bled)</w:t>
+      </w:r>
+    </w:p>
+    <w:tbl>
+      <w:tblPr>
+        <w:tblStyle w:val="TableGrid0"/>
+        <w:tblW w:w="0" w:type="auto"/>
+        <w:tblInd w:w="39" w:type="dxa"/>
+        <w:tblLook w:val="04A0" w:firstRow="1" w:lastRow="0" w:firstColumn="1" w:lastColumn="0" w:noHBand="0" w:noVBand="1"/>
+      </w:tblPr>
+      <w:tblGrid>
+        <w:gridCol w:w="2417"/>
+        <w:gridCol w:w="573"/>
+        <w:gridCol w:w="830"/>
+        <w:gridCol w:w="826"/>
+        <w:gridCol w:w="858"/>
+        <w:gridCol w:w="826"/>
+      </w:tblGrid>
+      <w:tr>
+        <w:tc>
+          <w:tcPr>
+            <w:tcW w:w="1944" w:type="dxa"/>
+          </w:tcPr>
+          <w:p>
+            <w:pPr>
+              <w:ind w:left="0" w:firstLine="0"/>
+            </w:pPr>
+            <w:r>
+              <w:t>Input Data</w:t>
+            </w:r>
+          </w:p>
+        </w:tc>
+        <w:tc>
+          <w:tcPr>
+            <w:tcW w:w="573" w:type="dxa"/>
+          </w:tcPr>
+          <w:p>
+            <w:pPr>
+              <w:ind w:left="0" w:firstLine="0"/>
+            </w:pPr>
+            <w:r>
+              <w:t>Test</w:t>
+            </w:r>
+          </w:p>
+        </w:tc>
+        <w:tc>
+          <w:tcPr>
+            <w:tcW w:w="830" w:type="dxa"/>
+          </w:tcPr>
+          <w:p>
+            <w:pPr>
+              <w:ind w:left="0" w:firstLine="0"/>
+            </w:pPr>
+            <w:r>
+              <w:t>Time (s)</w:t>
+            </w:r>
+          </w:p>
+        </w:tc>
+        <w:tc>
+          <w:tcPr>
+            <w:tcW w:w="826" w:type="dxa"/>
+          </w:tcPr>
+          <w:p>
+            <w:pPr>
+              <w:ind w:left="0" w:firstLine="0"/>
+            </w:pPr>
+            <w:r>
+              <w:t>Input Tokens</w:t>
+            </w:r>
+          </w:p>
+        </w:tc>
+        <w:tc>
+          <w:tcPr>
+            <w:tcW w:w="858" w:type="dxa"/>
+          </w:tcPr>
+          <w:p>
+            <w:pPr>
+              <w:ind w:left="0" w:firstLine="0"/>
+            </w:pPr>
+            <w:r>
+              <w:t>Output Tokens</w:t>
+            </w:r>
+          </w:p>
+        </w:tc>
+        <w:tc>
+          <w:tcPr>
+            <w:tcW w:w="826" w:type="dxa"/>
+          </w:tcPr>
+          <w:p>
+            <w:pPr>
+              <w:ind w:left="0" w:firstLine="0"/>
+            </w:pPr>
+            <w:r>
+              <w:t>Total Tokens</w:t>
+            </w:r>
+          </w:p>
+        </w:tc>
+      </w:tr>
+      <w:tr>
+        <w:tc>
+          <w:tcPr>
+            <w:tcW w:w="1944" w:type="dxa"/>
+          </w:tcPr>
+          <w:p>
+            <w:pPr>
+              <w:ind w:left="0" w:firstLine="0"/>
+            </w:pPr>
+            <w:r>
+              <w:t>northStarServiceScan.txt</w:t>
+            </w:r>
+          </w:p>
+        </w:tc>
+        <w:tc>
+          <w:tcPr>
+            <w:tcW w:w="573" w:type="dxa"/>
+          </w:tcPr>
+          <w:p>
+            <w:pPr>
+              <w:ind w:left="0" w:firstLine="0"/>
+            </w:pPr>
+            <w:r>
+              <w:t>1</w:t>
+            </w:r>
+          </w:p>
+        </w:tc>
+        <w:tc>
+          <w:tcPr>
+            <w:tcW w:w="830" w:type="dxa"/>
+          </w:tcPr>
+          <w:p>
+            <w:pPr>
+              <w:ind w:left="0" w:firstLine="0"/>
+            </w:pPr>
+            <w:r>
+              <w:t>94.05</w:t>
+            </w:r>
+          </w:p>
+        </w:tc>
+        <w:tc>
+          <w:tcPr>
+            <w:tcW w:w="826" w:type="dxa"/>
+          </w:tcPr>
+          <w:p>
+            <w:pPr>
+              <w:ind w:left="0" w:firstLine="0"/>
+            </w:pPr>
+            <w:r>
+              <w:t>3440</w:t>
+            </w:r>
+          </w:p>
+        </w:tc>
+        <w:tc>
+          <w:tcPr>
+            <w:tcW w:w="858" w:type="dxa"/>
+          </w:tcPr>
+          <w:p>
+            <w:pPr>
+              <w:ind w:left="0" w:firstLine="0"/>
+            </w:pPr>
+            <w:r>
+              <w:t>5609</w:t>
+            </w:r>
+          </w:p>
+        </w:tc>
+        <w:tc>
+          <w:tcPr>
+            <w:tcW w:w="826" w:type="dxa"/>
+          </w:tcPr>
+          <w:p>
+            <w:pPr>
+              <w:ind w:left="0" w:firstLine="0"/>
+            </w:pPr>
+            <w:r>
+              <w:t>9049</w:t>
+            </w:r>
+          </w:p>
+        </w:tc>
+      </w:tr>
+      <w:tr>
+        <w:tc>
+          <w:tcPr>
+            <w:tcW w:w="1944" w:type="dxa"/>
+          </w:tcPr>
+          <w:p>
+            <w:pPr>
+              <w:ind w:left="0" w:firstLine="0"/>
+            </w:pPr>
+            <w:r>
+              <w:t>northStarServiceScan.txt</w:t>
+            </w:r>
+          </w:p>
+        </w:tc>
+        <w:tc>
+          <w:tcPr>
+            <w:tcW w:w="573" w:type="dxa"/>
+          </w:tcPr>
+          <w:p>
+            <w:pPr>
+              <w:ind w:left="0" w:firstLine="0"/>
+            </w:pPr>
+            <w:r>
+              <w:t>2</w:t>
+            </w:r>
+          </w:p>
+        </w:tc>
+        <w:tc>
+          <w:tcPr>
+            <w:tcW w:w="830" w:type="dxa"/>
+          </w:tcPr>
+          <w:p>
+            <w:pPr>
+              <w:ind w:left="0" w:firstLine="0"/>
+            </w:pPr>
+            <w:r>
+              <w:t>90.95</w:t>
+            </w:r>
+          </w:p>
+        </w:tc>
+        <w:tc>
+          <w:tcPr>
+            <w:tcW w:w="826" w:type="dxa"/>
+          </w:tcPr>
+          <w:p>
+            <w:pPr>
+              <w:ind w:left="0" w:firstLine="0"/>
+            </w:pPr>
+            <w:r>
+              <w:t>3440</w:t>
+            </w:r>
+          </w:p>
+        </w:tc>
+        <w:tc>
+          <w:tcPr>
+            <w:tcW w:w="858" w:type="dxa"/>
+          </w:tcPr>
+          <w:p>
+            <w:pPr>
+              <w:ind w:left="0" w:firstLine="0"/>
+            </w:pPr>
+            <w:r>
+              <w:t>5574</w:t>
+            </w:r>
+          </w:p>
+        </w:tc>
+        <w:tc>
+          <w:tcPr>
+            <w:tcW w:w="826" w:type="dxa"/>
+          </w:tcPr>
+          <w:p>
+            <w:pPr>
+              <w:ind w:left="0" w:firstLine="0"/>
+            </w:pPr>
+            <w:r>
+              <w:t>9014</w:t>
+            </w:r>
+          </w:p>
+        </w:tc>
+      </w:tr>
+      <w:tr>
+        <w:tc>
+          <w:tcPr>
+            <w:tcW w:w="1944" w:type="dxa"/>
+          </w:tcPr>
+          <w:p>
+            <w:pPr>
+              <w:ind w:left="0" w:firstLine="0"/>
+            </w:pPr>
+            <w:r>
+              <w:t>northStarServiceScan.txt</w:t>
+            </w:r>
+          </w:p>
+        </w:tc>
+        <w:tc>
+          <w:tcPr>
+            <w:tcW w:w="573" w:type="dxa"/>
+          </w:tcPr>
+          <w:p>
+            <w:pPr>
+              <w:ind w:left="0" w:firstLine="0"/>
+            </w:pPr>
+            <w:r>
+              <w:t>3</w:t>
+            </w:r>
+          </w:p>
+        </w:tc>
+        <w:tc>
+          <w:tcPr>
+            <w:tcW w:w="830" w:type="dxa"/>
+          </w:tcPr>
+          <w:p>
+            <w:pPr>
+              <w:ind w:left="0" w:firstLine="0"/>
+            </w:pPr>
+            <w:r>
+              <w:t>91.44</w:t>
+            </w:r>
+          </w:p>
+        </w:tc>
+        <w:tc>
+          <w:tcPr>
+            <w:tcW w:w="826" w:type="dxa"/>
+          </w:tcPr>
+          <w:p>
+            <w:pPr>
+              <w:ind w:left="0" w:firstLine="0"/>
+            </w:pPr>
+            <w:r>
+              <w:t>3440</w:t>
+            </w:r>
+          </w:p>
+        </w:tc>
+        <w:tc>
+          <w:tcPr>
+            <w:tcW w:w="858" w:type="dxa"/>
+          </w:tcPr>
+          <w:p>
+            <w:pPr>
+              <w:ind w:left="0" w:firstLine="0"/>
+            </w:pPr>
+            <w:r>
+              <w:t>5602</w:t>
+            </w:r>
+          </w:p>
+        </w:tc>
+        <w:tc>
+          <w:tcPr>
+            <w:tcW w:w="826" w:type="dxa"/>
+          </w:tcPr>
+          <w:p>
+            <w:pPr>
+              <w:ind w:left="0" w:firstLine="0"/>
+            </w:pPr>
+            <w:r>
+              <w:t>9042</w:t>
+            </w:r>
+          </w:p>
+        </w:tc>
+      </w:tr>
+    </w:tbl>
+    <w:p>
+      <w:pPr>
+        <w:pStyle w:val="TNR"/>
+      </w:pPr>
+    </w:p>
+    <w:p>
+      <w:pPr>
+        <w:pStyle w:val="TNR"/>
+      </w:pPr>
+      <w:r>
+        <w:t xml:space="preserve">There is a clear increase of ~30% in the report generation time, and a similar increase in the number of output tokens allocated to produce the </w:t>
+      </w:r>
+      <w:r>
+        <w:t>report.</w:t>
+      </w:r>
+    </w:p>
+    <w:p>
+      <w:pPr>
+        <w:ind w:left="0" w:firstLine="0"/>
+        <w:rPr>
+          <w:b/>
+          <w:bCs/>
+          <w:sz w:val="24"/>
+        </w:rPr>
+      </w:pPr>
+    </w:p>
+    <w:p>
+      <w:pPr>
+        <w:ind w:left="0" w:firstLine="0"/>
+        <w:rPr>
+          <w:b/>
+          <w:bCs/>
+          <w:sz w:val="24"/>
+        </w:rPr>
+      </w:pPr>
+    </w:p>
+    <w:p>
+      <w:pPr>
+        <w:ind w:left="0" w:firstLine="0"/>
+        <w:rPr>
+          <w:b/>
+          <w:bCs/>
+          <w:sz w:val="24"/>
+        </w:rPr>
+      </w:pPr>
+    </w:p>
+    <w:p>
+      <w:pPr>
+        <w:ind w:left="0" w:firstLine="0"/>
+        <w:rPr>
+          <w:b/>
+          <w:bCs/>
+          <w:sz w:val="24"/>
+        </w:rPr>
+      </w:pPr>
+    </w:p>
+    <w:p>
+      <w:pPr>
+        <w:ind w:left="0" w:firstLine="0"/>
+        <w:rPr>
+          <w:b/>
+          <w:bCs/>
+          <w:sz w:val="24"/>
+        </w:rPr>
+      </w:pPr>
+    </w:p>
+    <w:p>
+      <w:pPr>
+        <w:ind w:left="0" w:firstLine="0"/>
+        <w:rPr>
+          <w:b/>
+          <w:bCs/>
+          <w:sz w:val="24"/>
+        </w:rPr>
+      </w:pPr>
+    </w:p>
+    <w:p>
+      <w:pPr>
+        <w:ind w:left="0" w:firstLine="0"/>
+        <w:rPr>
+          <w:b/>
+          <w:bCs/>
+          <w:sz w:val="24"/>
+        </w:rPr>
+      </w:pPr>
+      <w:r>
+        <w:rPr>
+          <w:b/>
+          <w:bCs/>
+          <w:sz w:val="24"/>
+        </w:rPr>
+        <w:lastRenderedPageBreak/>
+        <w:t>Quality</w:t>
+      </w:r>
+    </w:p>
+    <w:p>
+      <w:pPr>
+        <w:rPr>
+          <w:b/>
+          <w:bCs/>
+        </w:rPr>
+      </w:pPr>
+      <w:r>
+        <w:rPr>
+          <w:b/>
+          <w:bCs/>
+        </w:rPr>
+        <w:t xml:space="preserve">LLM misspelled </w:t>
+      </w:r>
+      <w:r>
+        <w:rPr>
+          <w:b/>
+          <w:bCs/>
+        </w:rPr>
+        <w:t>M</w:t>
+      </w:r>
+      <w:r>
+        <w:rPr>
+          <w:b/>
+          <w:bCs/>
+        </w:rPr>
+        <w:t>etasploitable</w:t>
+      </w:r>
+    </w:p>
+    <w:p>
+      <w:r>
+        <w:t>Although we cannot unequivocally assign enabled thinking as the cause for the typo, it is worth hypothesising so. This is because “thinking” forces the LLM to look over the same data multiple times, multiple reprocesses increase the risk that data is corrupted/modified by hallucination</w:t>
+      </w:r>
+      <w:r>
+        <w:t>, even with our model’s low temperature</w:t>
+      </w:r>
+      <w:r>
+        <w:t xml:space="preserve"> setting</w:t>
+      </w:r>
+      <w:r>
+        <w:t>.</w:t>
+      </w:r>
+    </w:p>
+    <w:p>
+      <w:r>
+        <w:rPr>
+          <w:noProof/>
+        </w:rPr>
+        <w:drawing>
+          <wp:inline distT="0" distB="0" distL="0" distR="0" wp14:anchorId="60F2EB6A" wp14:editId="16C440B1">
+            <wp:extent cx="4400751" cy="2258171"/>
+            <wp:effectExtent l="0" t="0" r="0" b="8890"/>
+            <wp:docPr id="2053425356" name="Picture 1"/>
+            <wp:cNvGraphicFramePr>
+              <a:graphicFrameLocks xmlns:a="http://schemas.openxmlformats.org/drawingml/2006/main" noChangeAspect="1"/>
+            </wp:cNvGraphicFramePr>
+            <a:graphic xmlns:a="http://schemas.openxmlformats.org/drawingml/2006/main">
+              <a:graphicData uri="http://schemas.openxmlformats.org/drawingml/2006/picture">
+                <pic:pic xmlns:pic="http://schemas.openxmlformats.org/drawingml/2006/picture">
+                  <pic:nvPicPr>
+                    <pic:cNvPr id="2053425356" name=""/>
+                    <pic:cNvPicPr/>
+                  </pic:nvPicPr>
+                  <pic:blipFill>
+                    <a:blip r:embed="rId15"/>
+                    <a:stretch>
+                      <a:fillRect/>
+                    </a:stretch>
+                  </pic:blipFill>
+                  <pic:spPr>
+                    <a:xfrm>
+                      <a:off x="0" y="0"/>
+                      <a:ext cx="4412665" cy="2264284"/>
+                    </a:xfrm>
+                    <a:prstGeom prst="rect">
+                      <a:avLst/>
+                    </a:prstGeom>
+                  </pic:spPr>
+                </pic:pic>
+              </a:graphicData>
+            </a:graphic>
+          </wp:inline>
+        </w:drawing>
+      </w:r>
+    </w:p>
+    <w:p/>
+    <w:p/>
+    <w:p/>
+    <w:p/>
+    <w:p/>
+    <w:p/>
+    <w:p/>
+    <w:p/>
+    <w:p/>
+    <w:p/>
+    <w:p/>
+    <w:p/>
+    <w:p/>
+    <w:p/>
+    <w:p/>
+    <w:p/>
+    <w:p/>
+    <w:p>
+      <w:r>
+        <w:lastRenderedPageBreak/>
+        <w:t xml:space="preserve">One extremely interesting finding is that ALL of the reports generated with thinking disabled all </w:t>
+      </w:r>
+      <w:r>
+        <w:t xml:space="preserve">erroneously </w:t>
+      </w:r>
+      <w:r>
+        <w:t>consider host .22 to have port 5900 (VNC service) and Apache Tomcat 8180 open (1, 2).</w:t>
+      </w:r>
+    </w:p>
+    <w:p>
+      <w:pPr>
+        <w:pStyle w:val="Caption"/>
+        <w:keepNext/>
+      </w:pPr>
+      <w:r>
+        <w:t xml:space="preserve">Figure </w:t>
+      </w:r>
+      <w:fldSimple w:instr=" SEQ Figure \* ARABIC ">
+        <w:r>
+          <w:rPr>
+            <w:noProof/>
+          </w:rPr>
+          <w:t>1</w:t>
+        </w:r>
+      </w:fldSimple>
+      <w:r>
+        <w:t xml:space="preserve"> - Report Generated with Thinking off</w:t>
+      </w:r>
+    </w:p>
+    <w:p>
+      <w:r>
+        <w:rPr>
+          <w:noProof/>
+        </w:rPr>
+        <w:drawing>
+          <wp:inline distT="0" distB="0" distL="0" distR="0" wp14:anchorId="2386251E" wp14:editId="2469C220">
+            <wp:extent cx="4723074" cy="2577983"/>
+            <wp:effectExtent l="0" t="0" r="1905" b="0"/>
+            <wp:docPr id="1892649265" name="Picture 1"/>
+            <wp:cNvGraphicFramePr>
+              <a:graphicFrameLocks xmlns:a="http://schemas.openxmlformats.org/drawingml/2006/main" noChangeAspect="1"/>
+            </wp:cNvGraphicFramePr>
+            <a:graphic xmlns:a="http://schemas.openxmlformats.org/drawingml/2006/main">
+              <a:graphicData uri="http://schemas.openxmlformats.org/drawingml/2006/picture">
+                <pic:pic xmlns:pic="http://schemas.openxmlformats.org/drawingml/2006/picture">
+                  <pic:nvPicPr>
+                    <pic:cNvPr id="1892649265" name=""/>
+                    <pic:cNvPicPr/>
+                  </pic:nvPicPr>
+                  <pic:blipFill>
+                    <a:blip r:embed="rId16"/>
+                    <a:stretch>
+                      <a:fillRect/>
+                    </a:stretch>
+                  </pic:blipFill>
+                  <pic:spPr>
+                    <a:xfrm>
+                      <a:off x="0" y="0"/>
+                      <a:ext cx="4726497" cy="2579851"/>
+                    </a:xfrm>
+                    <a:prstGeom prst="rect">
+                      <a:avLst/>
+                    </a:prstGeom>
+                  </pic:spPr>
+                </pic:pic>
+              </a:graphicData>
+            </a:graphic>
+          </wp:inline>
+        </w:drawing>
+      </w:r>
+    </w:p>
+    <w:p>
+      <w:r>
+        <w:t>The reason why is bec</w:t>
+      </w:r>
+      <w:r>
+        <w:t>ause the script prompt chunks by splitting this 82-line source scan in half (highlighted). The scan for host .21 (metasploitable) (1) is cut off during this process (2). Because this data appears in the second chunk above host .22’s scan (5), it is associated with the orphaned service info (4), (5) by the LLM. Even though the raw data</w:t>
+      </w:r>
+      <w:r>
+        <w:t xml:space="preserve"> from the Nmap scan</w:t>
+      </w:r>
+      <w:r>
+        <w:t xml:space="preserve"> actually points differently.</w:t>
+      </w:r>
+    </w:p>
+    <w:p>
+      <w:r>
+        <w:rPr>
+          <w:noProof/>
+        </w:rPr>
+        <w:drawing>
+          <wp:inline distT="0" distB="0" distL="0" distR="0" wp14:anchorId="181B0E53" wp14:editId="4D969391">
+            <wp:extent cx="4826441" cy="4143369"/>
+            <wp:effectExtent l="0" t="0" r="0" b="0"/>
+            <wp:docPr id="1516933031" name="Picture 1"/>
+            <wp:cNvGraphicFramePr>
+              <a:graphicFrameLocks xmlns:a="http://schemas.openxmlformats.org/drawingml/2006/main" noChangeAspect="1"/>
+            </wp:cNvGraphicFramePr>
+            <a:graphic xmlns:a="http://schemas.openxmlformats.org/drawingml/2006/main">
+              <a:graphicData uri="http://schemas.openxmlformats.org/drawingml/2006/picture">
+                <pic:pic xmlns:pic="http://schemas.openxmlformats.org/drawingml/2006/picture">
+                  <pic:nvPicPr>
+                    <pic:cNvPr id="1516933031" name=""/>
+                    <pic:cNvPicPr/>
+                  </pic:nvPicPr>
+                  <pic:blipFill>
+                    <a:blip r:embed="rId17"/>
+                    <a:stretch>
+                      <a:fillRect/>
+                    </a:stretch>
+                  </pic:blipFill>
+                  <pic:spPr>
+                    <a:xfrm>
+                      <a:off x="0" y="0"/>
+                      <a:ext cx="4847477" cy="4161428"/>
+                    </a:xfrm>
+                    <a:prstGeom prst="rect">
+                      <a:avLst/>
+                    </a:prstGeom>
+                  </pic:spPr>
+                </pic:pic>
+              </a:graphicData>
+            </a:graphic>
+          </wp:inline>
+        </w:drawing>
+      </w:r>
+    </w:p>
+    <w:p>
+      <w:r>
+        <w:lastRenderedPageBreak/>
+        <w:t xml:space="preserve">The script with thinking enabled on its prompts however is able to piece together and recontextualize the chunks more accurately. </w:t>
+      </w:r>
+      <w:r>
+        <w:t xml:space="preserve">This is evident in ALL of the reports I generated. </w:t>
+      </w:r>
+      <w:r>
+        <w:t>They are all able to assign the exposed services to the host that the original Nmap scan identified.</w:t>
+      </w:r>
+      <w:r>
+        <w:t xml:space="preserve"> This finding is worth writing about and demonstrating to the client as a limitation of AI when working with local AI on DFIR datasets.</w:t>
+      </w:r>
+    </w:p>
+    <w:p>
+      <w:pPr>
+        <w:pStyle w:val="Caption"/>
+        <w:keepNext/>
+      </w:pPr>
+      <w:r>
+        <w:t xml:space="preserve">Figure </w:t>
+      </w:r>
+      <w:fldSimple w:instr=" SEQ Figure \* ARABIC ">
+        <w:r>
+          <w:rPr>
+            <w:noProof/>
+          </w:rPr>
+          <w:t>2</w:t>
+        </w:r>
+      </w:fldSimple>
+      <w:r>
+        <w:t xml:space="preserve"> - Report Generated with Thinking on</w:t>
+      </w:r>
+    </w:p>
+    <w:p>
+      <w:r>
+        <w:rPr>
+          <w:noProof/>
+        </w:rPr>
+        <w:drawing>
+          <wp:inline distT="0" distB="0" distL="0" distR="0" wp14:anchorId="5BE635E1" wp14:editId="5BA264CD">
+            <wp:extent cx="5729605" cy="3475355"/>
+            <wp:effectExtent l="0" t="0" r="4445" b="0"/>
+            <wp:docPr id="1654753205" name="Picture 1"/>
+            <wp:cNvGraphicFramePr>
+              <a:graphicFrameLocks xmlns:a="http://schemas.openxmlformats.org/drawingml/2006/main" noChangeAspect="1"/>
+            </wp:cNvGraphicFramePr>
+            <a:graphic xmlns:a="http://schemas.openxmlformats.org/drawingml/2006/main">
+              <a:graphicData uri="http://schemas.openxmlformats.org/drawingml/2006/picture">
+                <pic:pic xmlns:pic="http://schemas.openxmlformats.org/drawingml/2006/picture">
+                  <pic:nvPicPr>
+                    <pic:cNvPr id="1654753205" name=""/>
+                    <pic:cNvPicPr/>
+                  </pic:nvPicPr>
+                  <pic:blipFill>
+                    <a:blip r:embed="rId18"/>
+                    <a:stretch>
+                      <a:fillRect/>
+                    </a:stretch>
+                  </pic:blipFill>
+                  <pic:spPr>
+                    <a:xfrm>
+                      <a:off x="0" y="0"/>
+                      <a:ext cx="5729605" cy="3475355"/>
+                    </a:xfrm>
+                    <a:prstGeom prst="rect">
+                      <a:avLst/>
+                    </a:prstGeom>
+                  </pic:spPr>
+                </pic:pic>
+              </a:graphicData>
+            </a:graphic>
+          </wp:inline>
+        </w:drawing>
+      </w:r>
+    </w:p>
+    <w:p/>
+    <w:p/>
+    <w:p>
+      <w:pPr>
+        <w:ind w:left="0" w:firstLine="0"/>
+      </w:pPr>
+    </w:p>
+    <w:p/>
+    <w:p/>
+    <w:p/>
+    <w:p/>
+    <w:p/>
+    <w:p/>
+    <w:p/>
+    <w:p/>
+    <w:p/>
+    <w:p/>
+    <w:p>
+      <w:pPr>
+        <w:ind w:left="0" w:firstLine="0"/>
+      </w:pPr>
+    </w:p>
+    <w:p>
+      <w:pPr>
+        <w:pStyle w:val="Heading2"/>
+      </w:pPr>
+      <w:bookmarkStart w:id="9" w:name="_Toc242865860"/>
+      <w:r>
+        <w:lastRenderedPageBreak/>
+        <w:t>Development</w:t>
+      </w:r>
+      <w:bookmarkEnd w:id="9"/>
+    </w:p>
+    <w:p>
+      <w:pPr>
+        <w:ind w:left="0" w:firstLine="0"/>
+      </w:pPr>
+      <w:r>
+        <w:t>Monday, 12 October</w:t>
+      </w:r>
+    </w:p>
+    <w:p>
+      <w:pPr>
+        <w:ind w:left="0" w:firstLine="0"/>
+        <w:rPr>
+          <w:b/>
+          <w:bCs/>
+        </w:rPr>
+      </w:pPr>
+      <w:r>
+        <w:rPr>
+          <w:b/>
+          <w:bCs/>
+        </w:rPr>
+        <w:t>12:30 – 1:</w:t>
+      </w:r>
+      <w:r>
+        <w:rPr>
+          <w:b/>
+          <w:bCs/>
+        </w:rPr>
+        <w:t>45</w:t>
+      </w:r>
+      <w:r>
+        <w:rPr>
+          <w:b/>
+          <w:bCs/>
+        </w:rPr>
+        <w:t>PM</w:t>
+      </w:r>
+      <w:r>
+        <w:rPr>
+          <w:b/>
+          <w:bCs/>
+        </w:rPr>
+        <w:t xml:space="preserve"> (</w:t>
+      </w:r>
+      <w:r>
+        <w:rPr>
+          <w:b/>
+          <w:bCs/>
+        </w:rPr>
+        <w:t>1hr</w:t>
+      </w:r>
+      <w:r>
+        <w:rPr>
+          <w:b/>
+          <w:bCs/>
+        </w:rPr>
+        <w:t xml:space="preserve"> 15min</w:t>
+      </w:r>
+      <w:r>
+        <w:rPr>
+          <w:b/>
+          <w:bCs/>
+        </w:rPr>
+        <w:t>)</w:t>
+      </w:r>
+    </w:p>
+    <w:p>
+      <w:pPr>
+        <w:ind w:left="0" w:firstLine="0"/>
+      </w:pPr>
       <w:r>
         <w:t>Designing a team logo</w:t>
       </w:r>
@@ -4384,7 +5867,6 @@
         <w:rPr>
           <w:noProof/>
         </w:rPr>
-        <w:lastRenderedPageBreak/>
         <w:drawing>
           <wp:inline distT="0" distB="0" distL="0" distR="0" wp14:anchorId="70E2FEC4" wp14:editId="17B4C2A4">
             <wp:extent cx="2393007" cy="2399902"/>
@@ -4401,7 +5883,7 @@
                     <pic:cNvPicPr/>
                   </pic:nvPicPr>
                   <pic:blipFill>
-                    <a:blip r:embed="rId15"/>
+                    <a:blip r:embed="rId19"/>
                     <a:stretch>
                       <a:fillRect/>
                     </a:stretch>
@@ -4447,7 +5929,7 @@
                     <pic:cNvPicPr/>
                   </pic:nvPicPr>
                   <pic:blipFill>
-                    <a:blip r:embed="rId16"/>
+                    <a:blip r:embed="rId20"/>
                     <a:stretch>
                       <a:fillRect/>
                     </a:stretch>
@@ -4495,7 +5977,7 @@
                     <pic:cNvPicPr/>
                   </pic:nvPicPr>
                   <pic:blipFill>
-                    <a:blip r:embed="rId17"/>
+                    <a:blip r:embed="rId21"/>
                     <a:stretch>
                       <a:fillRect/>
                     </a:stretch>
@@ -4528,10 +6010,10 @@
       </w:pPr>
     </w:p>
     <w:sectPr>
-      <w:headerReference w:type="default" r:id="rId18"/>
-      <w:footerReference w:type="even" r:id="rId19"/>
-      <w:footerReference w:type="default" r:id="rId20"/>
-      <w:footerReference w:type="first" r:id="rId21"/>
+      <w:headerReference w:type="default" r:id="rId22"/>
+      <w:footerReference w:type="even" r:id="rId23"/>
+      <w:footerReference w:type="default" r:id="rId24"/>
+      <w:footerReference w:type="first" r:id="rId25"/>
       <w:pgSz w:w="11906" w:h="16838"/>
       <w:pgMar w:top="1483" w:right="1448" w:bottom="1544" w:left="1435" w:header="720" w:footer="730" w:gutter="0"/>
       <w:pgNumType w:start="0"/>
@@ -5944,6 +7426,26 @@
       <w:ind w:left="440"/>
     </w:pPr>
   </w:style>
+  <w:style w:type="paragraph" w:styleId="Caption">
+    <w:name w:val="caption"/>
+    <w:basedOn w:val="Normal"/>
+    <w:next w:val="Normal"/>
+    <w:uiPriority w:val="35"/>
+    <w:semiHidden/>
+    <w:unhideWhenUsed/>
+    <w:qFormat/>
+    <w:rsid w:val="00FE2E20"/>
+    <w:pPr>
+      <w:spacing w:after="200" w:line="240" w:lineRule="auto"/>
+    </w:pPr>
+    <w:rPr>
+      <w:i/>
+      <w:iCs/>
+      <w:color w:val="0E2841" w:themeColor="text2"/>
+      <w:sz w:val="18"/>
+      <w:szCs w:val="18"/>
+    </w:rPr>
+  </w:style>
 </w:styles>
 </file>
 

</xml_diff>